<commit_message>
Renumber Appendix D sequentially; the list skipped item 3
</commit_message>
<xml_diff>
--- a/paper/Lo_2026_Following_the_Preference.docx
+++ b/paper/Lo_2026_Following_the_Preference.docx
@@ -4295,7 +4295,7 @@
         <w:t xml:space="preserve">FW</w:t>
       </w:r>
       <w:r>
-        <w:t xml:space="preserve">. The NYCHVS rent benchmark requires no API key; the ACS borough benchmark below requires one and it was obtained (Appendix D, item 6). Tenure coding was verified rather than assumed — the renter code carries positive gross rent and zero owner cost, and yields a weighted renter share of</w:t>
+        <w:t xml:space="preserve">. The NYCHVS rent benchmark requires no API key; the ACS borough benchmark below requires one and it was obtained (Appendix D, item 9). Tenure coding was verified rather than assumed — the renter code carries positive gross rent and zero owner cost, and yields a weighted renter share of</w:t>
       </w:r>
       <w:r>
         <w:t xml:space="preserve"> </w:t>
@@ -26133,28 +26133,6 @@
       <w:r>
         <w:t xml:space="preserve">Order randomization, forced full-ranking before selection, pre-sorted input, and tool-based sorting. These four would distinguish attention dilution from numeric-comparison instability from output-stage execution error. Highest-value remaining item after the retrieval-freedom arm, and cheap.</w:t>
       </w:r>
-      <w:r>
-        <w:t xml:space="preserve"> </w:t>
-      </w:r>
-      <w:r>
-        <w:t xml:space="preserve">2b.</w:t>
-      </w:r>
-      <w:r>
-        <w:t xml:space="preserve"> </w:t>
-      </w:r>
-      <w:r>
-        <w:rPr>
-          <w:bCs/>
-          <w:b/>
-        </w:rPr>
-        <w:t xml:space="preserve">Replicate §8.10 (size sweep) on a second vendor.</w:t>
-      </w:r>
-      <w:r>
-        <w:t xml:space="preserve"> </w:t>
-      </w:r>
-      <w:r>
-        <w:t xml:space="preserve">~US$30 on Claude. §8.8 has already been replicated (Table 20b).</w:t>
-      </w:r>
     </w:p>
     <w:p>
       <w:pPr>
@@ -26168,13 +26146,13 @@
           <w:bCs/>
           <w:b/>
         </w:rPr>
-        <w:t xml:space="preserve">Naturalistic-pool arm.</w:t>
-      </w:r>
-      <w:r>
-        <w:t xml:space="preserve"> </w:t>
-      </w:r>
-      <w:r>
-        <w:t xml:space="preserve">Candidates sampled as a real search would return them, without the enforced 2:1 infeasible ratio, before any claim about real-world prevalence.</w:t>
+        <w:t xml:space="preserve">Replicate §8.10 (size sweep) on a second vendor.</w:t>
+      </w:r>
+      <w:r>
+        <w:t xml:space="preserve"> </w:t>
+      </w:r>
+      <w:r>
+        <w:t xml:space="preserve">~US$30 on Claude. §8.8 has already been replicated (Table 20b).</w:t>
       </w:r>
     </w:p>
     <w:p>
@@ -26189,6 +26167,27 @@
           <w:bCs/>
           <w:b/>
         </w:rPr>
+        <w:t xml:space="preserve">Naturalistic-pool arm.</w:t>
+      </w:r>
+      <w:r>
+        <w:t xml:space="preserve"> </w:t>
+      </w:r>
+      <w:r>
+        <w:t xml:space="preserve">Candidates sampled as a real search would return them, without the enforced 2:1 infeasible ratio, before any claim about real-world prevalence.</w:t>
+      </w:r>
+    </w:p>
+    <w:p>
+      <w:pPr>
+        <w:numPr>
+          <w:ilvl w:val="0"/>
+          <w:numId w:val="1013"/>
+        </w:numPr>
+      </w:pPr>
+      <w:r>
+        <w:rPr>
+          <w:bCs/>
+          <w:b/>
+        </w:rPr>
         <w:t xml:space="preserve">Name-perception validation (Appendix B) — partially closed, and rescoped.</w:t>
       </w:r>
       <w:r>
@@ -26271,15 +26270,14 @@
       <w:r>
         <w:t xml:space="preserve">detecting an effect. Closing this item properly means obtaining per-name estimates as data from the authors or a replication archive, rebuilding both pools matched on perceived class, and re-running C1/C2 — a new collection, not a re-analysis. Until then C3 (voucher) carries the identity analysis, and it needs no name instrument.</w:t>
       </w:r>
-      <w:r>
-        <w:t xml:space="preserve"> </w:t>
-      </w:r>
-      <w:r>
-        <w:t xml:space="preserve">5b.</w:t>
-      </w:r>
-      <w:r>
-        <w:t xml:space="preserve"> </w:t>
-      </w:r>
+    </w:p>
+    <w:p>
+      <w:pPr>
+        <w:numPr>
+          <w:ilvl w:val="0"/>
+          <w:numId w:val="1013"/>
+        </w:numPr>
+      </w:pPr>
       <w:r>
         <w:rPr>
           <w:bCs/>
@@ -26293,15 +26291,14 @@
       <w:r>
         <w:t xml:space="preserve">The nine-route check in §5.2 is a sanity test, not a validation. A 50–100 route comparison against an independent routing source, reporting MAE, median absolute error and 90th-percentile error stratified by borough, is needed before the commute layer can be called validated.</w:t>
       </w:r>
-      <w:r>
-        <w:t xml:space="preserve"> </w:t>
-      </w:r>
-      <w:r>
-        <w:t xml:space="preserve">5c.</w:t>
-      </w:r>
-      <w:r>
-        <w:t xml:space="preserve"> </w:t>
-      </w:r>
+    </w:p>
+    <w:p>
+      <w:pPr>
+        <w:numPr>
+          <w:ilvl w:val="0"/>
+          <w:numId w:val="1013"/>
+        </w:numPr>
+      </w:pPr>
       <w:r>
         <w:rPr>
           <w:bCs/>
@@ -26315,15 +26312,14 @@
       <w:r>
         <w:t xml:space="preserve">§6.2 detection is keyword-based. The observed rate is 0.0% across 6,631 responses, but a blind double-coding of 100–200 sampled responses with reported agreement would establish that the rule is not simply failing to fire.</w:t>
       </w:r>
-      <w:r>
-        <w:t xml:space="preserve"> </w:t>
-      </w:r>
-      <w:r>
-        <w:t xml:space="preserve">5d.</w:t>
-      </w:r>
-      <w:r>
-        <w:t xml:space="preserve"> </w:t>
-      </w:r>
+    </w:p>
+    <w:p>
+      <w:pPr>
+        <w:numPr>
+          <w:ilvl w:val="0"/>
+          <w:numId w:val="1013"/>
+        </w:numPr>
+      </w:pPr>
       <w:r>
         <w:rPr>
           <w:bCs/>

</xml_diff>

<commit_message>
Correct two stale call counts in the front matter
The Status note reported results from "6,120 audited model calls", which is
the grid as it stood before the claude-opus-5 arm was added (luna 5,400 + sol
720). It contradicted the abstract on page 1. Now states the actual totals:
9,945 attempted, 9,601 parsed (96.5%), of which the matched identity grid is
6,840 attempted and 6,631 parsed, with the remainder attributed to the
priority, pool-density and size-sweep arms.

7.1 carried the same 6,120 for the identity-inference call count. Corrected to
6,840, which is the identity grid specifically -- the supplementary arms vary
priority, pool composition or set size, not the identity cue, so they do not
enter identity inference. The sentence's argument is unaffected either way.

Counts verified against the append-only logs rather than the manuscript:
audit_log 6,840/6,631; priority_swap 1,350/1,338; priority_swap_claude
165/157; pool_density 800/784; size_sweep 790/691.
</commit_message>
<xml_diff>
--- a/paper/Lo_2026_Following_the_Preference.docx
+++ b/paper/Lo_2026_Following_the_Preference.docx
@@ -70,7 +70,23 @@
         <w:t xml:space="preserve"> </w:t>
       </w:r>
       <w:r>
-        <w:t xml:space="preserve">v0.2, 6 September 2026. Sections 1–8 and 10 report completed results from 6,120 audited model calls. Section 9 is written against those results. Earlier status note (pre-data, v0.1) superseded.</w:t>
+        <w:t xml:space="preserve">v0.2, 6 September 2026. Sections 1–8 and 10 report completed results from</w:t>
+      </w:r>
+      <w:r>
+        <w:t xml:space="preserve"> </w:t>
+      </w:r>
+      <w:r>
+        <w:rPr>
+          <w:bCs/>
+          <w:b/>
+        </w:rPr>
+        <w:t xml:space="preserve">9,945 attempted model calls (9,601 parsed, 96.5%)</w:t>
+      </w:r>
+      <w:r>
+        <w:t xml:space="preserve"> </w:t>
+      </w:r>
+      <w:r>
+        <w:t xml:space="preserve">across three models and two vendors, of which the matched identity grid is 6,840 attempted (6,631 parsed); the remainder are the within-scenario priority, pool-density and candidate-set-size arms (Table 12b). Section 9 is written against those results. Earlier status note (pre-data, v0.1) superseded.</w:t>
       </w:r>
     </w:p>
     <w:p>
@@ -9251,7 +9267,7 @@
         <w:t xml:space="preserve">within-scenario matched design</w:t>
       </w:r>
       <w:r>
-        <w:t xml:space="preserve">: the four identity conditions face an identical request and an identical candidate pool. Identity effects are matched contrasts, not between-group comparisons, and the effective sample size for identity inference is the number of scenarios (150), not the number of model calls (6,120). We state this explicitly because treating calls as independent observations is the characteristic inferential error of large-scale LLM audits.</w:t>
+        <w:t xml:space="preserve">: the four identity conditions face an identical request and an identical candidate pool. Identity effects are matched contrasts, not between-group comparisons, and the effective sample size for identity inference is the number of scenarios (150), not the number of model calls (6,840). We state this explicitly because treating calls as independent observations is the characteristic inferential error of large-scale LLM audits.</w:t>
       </w:r>
     </w:p>
     <w:bookmarkEnd w:id="47"/>

</xml_diff>